<commit_message>
Add resume review loop, JD archive, and VOICE.md voice pass to /job-apply
- Step 10: recruiter-audit loop that iterates the tailored resume until it
  scores >= 80/100 (max 5 passes, never fabricates), with a new
  Job Resume Review template.
- Step 4: archive the full raw job description so it survives a dead URL.
- VOICE.md is now the authoritative voice for everything written, threaded
  through read, resume, and cover-letter steps.
- Step 12: final AI-smell and voice pass that remediates em dashes, filler,
  and robotic cadence in the resume and cover letter.
- Apply all of the above to the Firstup application (score 84, dash-free)
  and fix em-dash separators in the resume template.

Co-Authored-By: Claude Opus 4.6 <noreply@anthropic.com>
</commit_message>
<xml_diff>
--- a/00 Human/30 Projects/Job Search/Firstup/chris-monnat-resume(firstup).docx
+++ b/00 Human/30 Projects/Job Search/Firstup/chris-monnat-resume(firstup).docx
@@ -379,7 +379,7 @@
           <w:sz w:val="32"/>
           <w:szCs w:val="32"/>
         </w:rPr>
-        <w:t>VP, Software Engineering — Platform</w:t>
+        <w:t xml:space="preserve">VP, Software Engineering (Platform)</w:t>
       </w:r>
     </w:p>
     <w:p>
@@ -414,7 +414,7 @@
           <w:sz w:val="22"/>
           <w:szCs w:val="22"/>
         </w:rPr>
-        <w:t>Platform Engineering | Agentic AI | Enterprise SaaS at Scale</w:t>
+        <w:t xml:space="preserve">Platform Engineering | Agentic AI | Enterprise SaaS at Scale</w:t>
       </w:r>
     </w:p>
     <w:p>
@@ -440,7 +440,7 @@
           <w:sz w:val="22"/>
           <w:szCs w:val="22"/>
         </w:rPr>
-        <w:t>Hands-on engineering executive with 20 years building platform organizations and the shared services, data systems, and developer experience that scale them. Founded and scaled a cross-functional org from 8 to 40+ engineers, stood up a paved-road operating model that cut speed-to-market 35%, and delivered a revenue-critical platform from zero to production in under 90 days, protecting an 8-figure revenue line. Currently building and advising on agentic AI systems—tool management, model evaluation, AI-native development lifecycles, and governance—for enterprise clients. Known for converting repeated engineering needs into well-adopted platform capabilities and connecting platform investment directly to business outcomes.</w:t>
+        <w:t xml:space="preserve">Hands-on engineering executive with 20 years building platform organizations. Builds the shared services, data systems, and developer experience that let teams ship, on AWS, Kubernetes, Ruby on Rails, Node.js, Python, and PostgreSQL. Founded and scaled a cross-functional org from 8 to 40+ engineers. Stood up a self-service platform model now used across the portfolio. Today, builds agentic-AI systems with the OpenAI SDK and MCP: tool management, model evaluation, AI-native development, and governance for enterprise clients. Turns repeated engineering needs into platform capabilities teams actually adopt, then ties that work to business results.</w:t>
       </w:r>
     </w:p>
     <w:p>
@@ -504,8 +504,13 @@
               <w:spacing w:before="30" w:after="30"/>
               <w:contextualSpacing w:val="0"/>
             </w:pPr>
+            <w:proofErr w:type="gramStart"/>
             <w:r>
-              <w:t>Agentic AI Delivery: Lead hands-on agentic AI engineering and advisory for enterprise clients—building tool-management, model-interaction, and workflow-automation systems with clear evaluation and guardrails.</w:t>
+              <w:t xml:space="preserve">Agentic AI Delivery: </w:t>
+            </w:r>
+            <w:proofErr w:type="gramStart"/>
+            <w:r>
+              <w:t xml:space="preserve">Lead hands-on agentic AI engineering and advisory for enterprise clients. Build tool-management, model-interaction, and workflow-automation systems with clear evaluation and guardrails.</w:t>
             </w:r>
           </w:p>
           <w:p>
@@ -518,8 +523,13 @@
               <w:spacing w:before="30" w:after="30"/>
               <w:contextualSpacing w:val="0"/>
             </w:pPr>
+            <w:proofErr w:type="gramStart"/>
             <w:r>
-              <w:t>Platform Under Pressure: Delivered a revenue-critical demand-side platform from zero to production in under 90 days on AWS, protecting an 8-figure revenue line without compromising security or reliability.</w:t>
+              <w:t xml:space="preserve">Platform Under Pressure: </w:t>
+            </w:r>
+            <w:proofErr w:type="gramStart"/>
+            <w:r>
+              <w:t xml:space="preserve">Delivered a revenue-critical demand-side platform from zero to production in under 90 days on AWS, protecting an 8-figure revenue line without compromising security or reliability.</w:t>
             </w:r>
           </w:p>
           <w:p>
@@ -532,8 +542,13 @@
               <w:spacing w:before="30" w:after="30"/>
               <w:contextualSpacing w:val="0"/>
             </w:pPr>
+            <w:proofErr w:type="gramStart"/>
             <w:r>
-              <w:t>Org Scaling: Scaled a platform/shared-services engineering org from 8 to 40+ engineers across 5 cross-functional teams, supporting 100+ digital properties serving millions of users.</w:t>
+              <w:t xml:space="preserve">Org Scaling: </w:t>
+            </w:r>
+            <w:proofErr w:type="gramStart"/>
+            <w:r>
+              <w:t xml:space="preserve">Scaled a platform/shared-services engineering org from 8 to 40+ engineers across 5 cross-functional teams, supporting 100+ digital properties serving millions of users.</w:t>
             </w:r>
           </w:p>
           <w:p>
@@ -546,8 +561,13 @@
               <w:spacing w:before="30" w:after="30"/>
               <w:contextualSpacing w:val="0"/>
             </w:pPr>
+            <w:proofErr w:type="gramStart"/>
             <w:r>
-              <w:t>Paved-Road Model: Established a paved-road operating model—automated provisioning and deployment that improved speed-to-market 35% and was adopted across the broader portfolio.</w:t>
+              <w:t xml:space="preserve">Paved-Road Model: </w:t>
+            </w:r>
+            <w:proofErr w:type="gramStart"/>
+            <w:r>
+              <w:t xml:space="preserve">Established a paved-road operating model. Automated provisioning and deployment improved speed-to-market 35% and spread across the broader portfolio.</w:t>
             </w:r>
           </w:p>
         </w:tc>
@@ -628,13 +648,91 @@
                 <w:szCs w:val="22"/>
               </w:rPr>
             </w:pPr>
+            <w:proofErr w:type="gramStart"/>
             <w:r>
               <w:rPr>
                 <w:sz w:val="22"/>
                 <w:szCs w:val="22"/>
               </w:rPr>
-              <w:t>Platform Strategy &amp; Roadmap</w:t>
+              <w:t xml:space="preserve">Platform Strategy &amp; Roadmap</w:t>
             </w:r>
+          </w:p>
+          <w:p>
+            <w:pPr>
+              <w:jc w:val="center"/>
+              <w:rPr>
+                <w:sz w:val="22"/>
+                <w:szCs w:val="22"/>
+              </w:rPr>
+            </w:pPr>
+            <w:proofErr w:type="gramStart"/>
+            <w:r>
+              <w:rPr>
+                <w:sz w:val="22"/>
+                <w:szCs w:val="22"/>
+              </w:rPr>
+              <w:t xml:space="preserve">Shared Services &amp; Dev Experience</w:t>
+            </w:r>
+          </w:p>
+          <w:p>
+            <w:pPr>
+              <w:jc w:val="center"/>
+              <w:rPr>
+                <w:sz w:val="22"/>
+                <w:szCs w:val="22"/>
+              </w:rPr>
+            </w:pPr>
+            <w:proofErr w:type="gramStart"/>
+            <w:r>
+              <w:rPr>
+                <w:sz w:val="22"/>
+                <w:szCs w:val="22"/>
+              </w:rPr>
+              <w:t xml:space="preserve">Paved-Road / Internal Tooling</w:t>
+            </w:r>
+          </w:p>
+          <w:p>
+            <w:pPr>
+              <w:jc w:val="center"/>
+              <w:rPr>
+                <w:sz w:val="22"/>
+                <w:szCs w:val="22"/>
+              </w:rPr>
+            </w:pPr>
+            <w:proofErr w:type="gramStart"/>
+            <w:r>
+              <w:rPr>
+                <w:sz w:val="22"/>
+                <w:szCs w:val="22"/>
+              </w:rPr>
+              <w:t xml:space="preserve">Kubernetes &amp; AWS</w:t>
+            </w:r>
+          </w:p>
+          <w:p>
+            <w:pPr>
+              <w:jc w:val="center"/>
+              <w:rPr>
+                <w:sz w:val="22"/>
+                <w:szCs w:val="22"/>
+              </w:rPr>
+            </w:pPr>
+            <w:proofErr w:type="gramStart"/>
+            <w:r>
+              <w:rPr>
+                <w:sz w:val="22"/>
+                <w:szCs w:val="22"/>
+              </w:rPr>
+              <w:t xml:space="preserve">Reliability &amp; Observability</w:t>
+            </w:r>
+          </w:p>
+          <w:p>
+            <w:pPr>
+              <w:jc w:val="center"/>
+              <w:rPr>
+                <w:sz w:val="22"/>
+                <w:szCs w:val="22"/>
+              </w:rPr>
+            </w:pPr>
           </w:p>
           <w:p>
             <w:pPr>
@@ -649,55 +747,7 @@
                 <w:sz w:val="22"/>
                 <w:szCs w:val="22"/>
               </w:rPr>
-              <w:t>Shared Services &amp; Dev Experience</w:t>
-            </w:r>
-          </w:p>
-          <w:p>
-            <w:pPr>
-              <w:jc w:val="center"/>
-              <w:rPr>
-                <w:sz w:val="22"/>
-                <w:szCs w:val="22"/>
-              </w:rPr>
-            </w:pPr>
-            <w:r>
-              <w:rPr>
-                <w:sz w:val="22"/>
-                <w:szCs w:val="22"/>
-              </w:rPr>
-              <w:t>Paved-Road / Internal Tooling</w:t>
-            </w:r>
-          </w:p>
-          <w:p>
-            <w:pPr>
-              <w:jc w:val="center"/>
-              <w:rPr>
-                <w:sz w:val="22"/>
-                <w:szCs w:val="22"/>
-              </w:rPr>
-            </w:pPr>
-            <w:r>
-              <w:rPr>
-                <w:sz w:val="22"/>
-                <w:szCs w:val="22"/>
-              </w:rPr>
-              <w:t>Distributed Systems</w:t>
-            </w:r>
-          </w:p>
-          <w:p>
-            <w:pPr>
-              <w:jc w:val="center"/>
-              <w:rPr>
-                <w:sz w:val="22"/>
-                <w:szCs w:val="22"/>
-              </w:rPr>
-            </w:pPr>
-            <w:r>
-              <w:rPr>
-                <w:sz w:val="22"/>
-                <w:szCs w:val="22"/>
-              </w:rPr>
-              <w:t>Reliability &amp; Observability</w:t>
+              <w:t xml:space="preserve"> </w:t>
             </w:r>
           </w:p>
         </w:tc>
@@ -713,12 +763,13 @@
                 <w:szCs w:val="22"/>
               </w:rPr>
             </w:pPr>
+            <w:proofErr w:type="gramStart"/>
             <w:r>
               <w:rPr>
                 <w:sz w:val="22"/>
                 <w:szCs w:val="22"/>
               </w:rPr>
-              <w:t>CI/CD &amp; DevOps</w:t>
+              <w:t xml:space="preserve">CI/CD &amp; DevOps</w:t>
             </w:r>
           </w:p>
           <w:p>
@@ -729,12 +780,13 @@
                 <w:szCs w:val="22"/>
               </w:rPr>
             </w:pPr>
+            <w:proofErr w:type="gramStart"/>
             <w:r>
               <w:rPr>
                 <w:sz w:val="22"/>
                 <w:szCs w:val="22"/>
               </w:rPr>
-              <w:t>Agentic AI Platforms</w:t>
+              <w:t xml:space="preserve">Agentic AI (OpenAI SDK, MCP)</w:t>
             </w:r>
           </w:p>
           <w:p>
@@ -745,12 +797,13 @@
                 <w:szCs w:val="22"/>
               </w:rPr>
             </w:pPr>
+            <w:proofErr w:type="gramStart"/>
             <w:r>
               <w:rPr>
                 <w:sz w:val="22"/>
                 <w:szCs w:val="22"/>
               </w:rPr>
-              <w:t>Model Evaluation</w:t>
+              <w:t xml:space="preserve">Model Evaluation &amp; Guardrails</w:t>
             </w:r>
           </w:p>
           <w:p>
@@ -761,12 +814,13 @@
                 <w:szCs w:val="22"/>
               </w:rPr>
             </w:pPr>
+            <w:proofErr w:type="gramStart"/>
             <w:r>
               <w:rPr>
                 <w:sz w:val="22"/>
                 <w:szCs w:val="22"/>
               </w:rPr>
-              <w:t>AI-Native Development</w:t>
+              <w:t xml:space="preserve">AI-Native Development</w:t>
             </w:r>
           </w:p>
           <w:p>
@@ -777,12 +831,13 @@
                 <w:szCs w:val="22"/>
               </w:rPr>
             </w:pPr>
+            <w:proofErr w:type="gramStart"/>
             <w:r>
               <w:rPr>
                 <w:sz w:val="22"/>
                 <w:szCs w:val="22"/>
               </w:rPr>
-              <w:t>AI Governance &amp; Guardrails</w:t>
+              <w:t xml:space="preserve">Rails / Node.js / Python</w:t>
             </w:r>
           </w:p>
         </w:tc>
@@ -798,12 +853,13 @@
                 <w:szCs w:val="22"/>
               </w:rPr>
             </w:pPr>
+            <w:proofErr w:type="gramStart"/>
             <w:r>
               <w:rPr>
                 <w:sz w:val="22"/>
                 <w:szCs w:val="22"/>
               </w:rPr>
-              <w:t>Enterprise Integrations</w:t>
+              <w:t xml:space="preserve">Enterprise Integrations</w:t>
             </w:r>
           </w:p>
           <w:p>
@@ -814,12 +870,13 @@
                 <w:szCs w:val="22"/>
               </w:rPr>
             </w:pPr>
+            <w:proofErr w:type="gramStart"/>
             <w:r>
               <w:rPr>
                 <w:sz w:val="22"/>
                 <w:szCs w:val="22"/>
               </w:rPr>
-              <w:t>Data Pipeline Design</w:t>
+              <w:t xml:space="preserve">PostgreSQL &amp; Data Pipelines</w:t>
             </w:r>
           </w:p>
           <w:p>
@@ -830,12 +887,13 @@
                 <w:szCs w:val="22"/>
               </w:rPr>
             </w:pPr>
+            <w:proofErr w:type="gramStart"/>
             <w:r>
               <w:rPr>
                 <w:sz w:val="22"/>
                 <w:szCs w:val="22"/>
               </w:rPr>
-              <w:t>Security &amp; Compliance</w:t>
+              <w:t xml:space="preserve">Security &amp; Compliance</w:t>
             </w:r>
           </w:p>
           <w:p>
@@ -846,12 +904,13 @@
                 <w:szCs w:val="22"/>
               </w:rPr>
             </w:pPr>
+            <w:proofErr w:type="gramStart"/>
             <w:r>
               <w:rPr>
                 <w:sz w:val="22"/>
                 <w:szCs w:val="22"/>
               </w:rPr>
-              <w:t>Org Design &amp; Scaling</w:t>
+              <w:t xml:space="preserve">Org Design &amp; Scaling</w:t>
             </w:r>
           </w:p>
           <w:p>
@@ -862,12 +921,13 @@
                 <w:szCs w:val="22"/>
               </w:rPr>
             </w:pPr>
+            <w:proofErr w:type="gramStart"/>
             <w:r>
               <w:rPr>
                 <w:sz w:val="22"/>
                 <w:szCs w:val="22"/>
               </w:rPr>
-              <w:t>Executive Communication</w:t>
+              <w:t xml:space="preserve">Executive Communication</w:t>
             </w:r>
           </w:p>
           <w:p>
@@ -912,17 +972,13 @@
           <w:sz w:val="28"/>
           <w:szCs w:val="28"/>
         </w:rPr>
-        <w:t xml:space="preserve"> Experience</w:t>
-      </w:r>
-    </w:p>
-    <w:p>
-      <w:pPr>
-        <w:rPr>
-          <w:rFonts w:cstheme="minorHAnsi"/>
-          <w:sz w:val="20"/>
-          <w:szCs w:val="20"/>
-        </w:rPr>
-      </w:pPr>
+        <w:t xml:space="preserve"> Experience </w:t>
+      </w:r>
+    </w:p>
+    <w:p>
+      <w:r>
+        <w:t xml:space="preserve"/>
+      </w:r>
     </w:p>
     <w:p>
       <w:pPr>
@@ -931,12 +987,29 @@
           <w:color w:val="000000" w:themeColor="text1"/>
         </w:rPr>
       </w:pPr>
+      <w:proofErr w:type="gramStart"/>
       <w:r>
         <w:rPr>
           <w:rStyle w:val="IntenseReference"/>
           <w:color w:val="000000" w:themeColor="text1"/>
         </w:rPr>
-        <w:t xml:space="preserve">Dual Logic — Remote | 2026  </w:t>
+        <w:t xml:space="preserve">Dual Logic, </w:t>
+      </w:r>
+      <w:proofErr w:type="gramStart"/>
+      <w:r>
+        <w:rPr>
+          <w:rStyle w:val="IntenseReference"/>
+          <w:color w:val="000000" w:themeColor="text1"/>
+        </w:rPr>
+        <w:t xml:space="preserve">Remote | </w:t>
+      </w:r>
+      <w:proofErr w:type="gramStart"/>
+      <w:r>
+        <w:rPr>
+          <w:rStyle w:val="IntenseReference"/>
+          <w:color w:val="000000" w:themeColor="text1"/>
+        </w:rPr>
+        <w:t xml:space="preserve">2026  </w:t>
       </w:r>
       <w:r>
         <w:rPr>
@@ -954,12 +1027,13 @@
           <w:b/>
         </w:rPr>
       </w:pPr>
+      <w:proofErr w:type="gramStart"/>
       <w:r>
         <w:rPr>
           <w:rStyle w:val="IntenseReference"/>
           <w:color w:val="000000" w:themeColor="text1"/>
         </w:rPr>
-        <w:t>Head of Technology</w:t>
+        <w:t xml:space="preserve">Head of Technology</w:t>
       </w:r>
     </w:p>
     <w:p>
@@ -978,12 +1052,13 @@
           <w:color w:val="000000" w:themeColor="text1"/>
         </w:rPr>
       </w:pPr>
+      <w:proofErr w:type="gramStart"/>
       <w:r>
         <w:rPr>
           <w:rStyle w:val="IntenseReference"/>
           <w:color w:val="000000" w:themeColor="text1"/>
         </w:rPr>
-        <w:t>Hands-on AI engineering and advisory partnership building automation, workflow, and platform systems for enterprise clients.</w:t>
+        <w:t xml:space="preserve">Hands-on AI engineering and advisory partnership building automation, workflow, and platform systems for enterprise clients.</w:t>
       </w:r>
     </w:p>
     <w:p>
@@ -1005,12 +1080,13 @@
           <w:szCs w:val="21"/>
         </w:rPr>
       </w:pPr>
+      <w:proofErr w:type="gramStart"/>
       <w:r>
         <w:rPr>
           <w:rStyle w:val="IntenseReference"/>
           <w:color w:val="000000" w:themeColor="text1"/>
         </w:rPr>
-        <w:t>Build agentic AI and engagement-platform capabilities using AI-assisted engineering—hands-on across development, workflow automation, tool management, and model deployment at the code level.</w:t>
+        <w:t xml:space="preserve">Build agentic AI and engagement-platform capabilities with AI-assisted engineering, hands-on across development, workflow automation, tool management, and model deployment at the code level.</w:t>
       </w:r>
     </w:p>
     <w:p>
@@ -1032,12 +1108,13 @@
           <w:szCs w:val="21"/>
         </w:rPr>
       </w:pPr>
+      <w:proofErr w:type="gramStart"/>
       <w:r>
         <w:rPr>
           <w:rStyle w:val="IntenseReference"/>
           <w:color w:val="000000" w:themeColor="text1"/>
         </w:rPr>
-        <w:t>Advise CTOs and engineering leaders on AI governance, model evaluation, and an AI-native development lifecycle—standardizing agent skills, templates, and security guardrails.</w:t>
+        <w:t xml:space="preserve">Advise CTOs and engineering leaders on AI governance, model evaluation, and an AI-native development lifecycle, standardizing agent skills, templates, and security guardrails.</w:t>
       </w:r>
     </w:p>
     <w:p>
@@ -1059,13 +1136,13 @@
           <w:szCs w:val="21"/>
         </w:rPr>
       </w:pPr>
+      <w:proofErr w:type="gramStart"/>
       <w:r>
         <w:rPr>
           <w:rStyle w:val="IntenseReference"/>
           <w:color w:val="000000" w:themeColor="text1"/>
         </w:rPr>
-        <w:lastRenderedPageBreak/>
-        <w:t>Designed cohort-based AI enablement for an 800+ person SaaS enterprise, focused on ROI, developer productivity, and adoption.</w:t>
+        <w:t xml:space="preserve">Drove agentic-AI adoption across an 800+ person SaaS engineering org by standardizing reusable agent skills, evaluation harnesses, and security guardrails on the OpenAI SDK and MCP.</w:t>
       </w:r>
     </w:p>
     <w:p>
@@ -1081,7 +1158,11 @@
         </w:rPr>
       </w:pPr>
     </w:p>
-    <w:p/>
+    <w:p>
+      <w:r>
+        <w:t xml:space="preserve"/>
+      </w:r>
+    </w:p>
     <w:p>
       <w:pPr>
         <w:rPr>
@@ -1089,12 +1170,29 @@
           <w:color w:val="000000" w:themeColor="text1"/>
         </w:rPr>
       </w:pPr>
+      <w:proofErr w:type="gramStart"/>
       <w:r>
         <w:rPr>
           <w:rStyle w:val="IntenseReference"/>
           <w:color w:val="000000" w:themeColor="text1"/>
         </w:rPr>
-        <w:t xml:space="preserve">Pipeline 360 — Remote | 2025–2026  </w:t>
+        <w:t xml:space="preserve">Pipeline 360, </w:t>
+      </w:r>
+      <w:proofErr w:type="gramStart"/>
+      <w:r>
+        <w:rPr>
+          <w:rStyle w:val="IntenseReference"/>
+          <w:color w:val="000000" w:themeColor="text1"/>
+        </w:rPr>
+        <w:t xml:space="preserve">Remote | </w:t>
+      </w:r>
+      <w:proofErr w:type="gramStart"/>
+      <w:r>
+        <w:rPr>
+          <w:rStyle w:val="IntenseReference"/>
+          <w:color w:val="000000" w:themeColor="text1"/>
+        </w:rPr>
+        <w:t xml:space="preserve">2025-2026  </w:t>
       </w:r>
       <w:r>
         <w:rPr>
@@ -1112,12 +1210,13 @@
           <w:b/>
         </w:rPr>
       </w:pPr>
+      <w:proofErr w:type="gramStart"/>
       <w:r>
         <w:rPr>
           <w:rStyle w:val="IntenseReference"/>
           <w:color w:val="000000" w:themeColor="text1"/>
         </w:rPr>
-        <w:t>Sr. Vice President, Technology</w:t>
+        <w:t xml:space="preserve">Sr. Vice President, Technology</w:t>
       </w:r>
     </w:p>
     <w:p>
@@ -1136,12 +1235,13 @@
           <w:color w:val="000000" w:themeColor="text1"/>
         </w:rPr>
       </w:pPr>
+      <w:proofErr w:type="gramStart"/>
       <w:r>
         <w:rPr>
           <w:rStyle w:val="IntenseReference"/>
           <w:color w:val="000000" w:themeColor="text1"/>
         </w:rPr>
-        <w:t>Owned platform strategy and execution across product, engineering, data, IT, security, and compliance for a newly independent, PE-backed, 100% remote org of 100+.</w:t>
+        <w:t xml:space="preserve">Owned platform strategy and execution across product, engineering, data, IT, security, and compliance for a newly independent, PE-backed, 100% remote org of 100+.</w:t>
       </w:r>
     </w:p>
     <w:p>
@@ -1163,12 +1263,13 @@
           <w:szCs w:val="21"/>
         </w:rPr>
       </w:pPr>
+      <w:proofErr w:type="gramStart"/>
       <w:r>
         <w:rPr>
           <w:rStyle w:val="IntenseReference"/>
           <w:color w:val="000000" w:themeColor="text1"/>
         </w:rPr>
-        <w:t>Delivered a custom demand-side ad-buying/campaign platform on The Trade Desk from zero to production in under 90 days, protecting an 8-figure revenue line.</w:t>
+        <w:t xml:space="preserve">Delivered a custom demand-side ad-buying/campaign platform on The Trade Desk from zero to production in under 90 days, protecting an 8-figure revenue line.</w:t>
       </w:r>
     </w:p>
     <w:p>
@@ -1190,12 +1291,13 @@
           <w:szCs w:val="21"/>
         </w:rPr>
       </w:pPr>
+      <w:proofErr w:type="gramStart"/>
       <w:r>
         <w:rPr>
           <w:rStyle w:val="IntenseReference"/>
           <w:color w:val="000000" w:themeColor="text1"/>
         </w:rPr>
-        <w:t>Made architecture and infrastructure decisions across application, data, and infrastructure layers—balancing delivery velocity with long-term resilience and security.</w:t>
+        <w:t xml:space="preserve">Set architecture and infrastructure standards across application, data, and platform layers on AWS, Kubernetes, and PostgreSQL. Raised delivery velocity while hardening resilience and security.</w:t>
       </w:r>
     </w:p>
     <w:p>
@@ -1217,12 +1319,13 @@
           <w:szCs w:val="21"/>
         </w:rPr>
       </w:pPr>
+      <w:proofErr w:type="gramStart"/>
       <w:r>
         <w:rPr>
           <w:rStyle w:val="IntenseReference"/>
           <w:color w:val="000000" w:themeColor="text1"/>
         </w:rPr>
-        <w:t>Matured DevOps, CI/CD, cloud (AWS) optimization, and AI-assisted security and developer tooling to raise productivity and operational resilience.</w:t>
+        <w:t xml:space="preserve">Matured DevOps, CI/CD, cloud (AWS) optimization, and AI-assisted security and developer tooling to raise productivity and operational resilience.</w:t>
       </w:r>
     </w:p>
     <w:p>
@@ -1244,12 +1347,13 @@
           <w:szCs w:val="21"/>
         </w:rPr>
       </w:pPr>
+      <w:proofErr w:type="gramStart"/>
       <w:r>
         <w:rPr>
           <w:rStyle w:val="IntenseReference"/>
           <w:color w:val="000000" w:themeColor="text1"/>
         </w:rPr>
-        <w:t>Served as the sole technology voice in PE investor and board diligence, translating platform architecture and risk into capital-allocation decisions.</w:t>
+        <w:t xml:space="preserve">Served as the sole technology voice in PE investor and board diligence, translating platform architecture and risk into capital-allocation decisions.</w:t>
       </w:r>
     </w:p>
     <w:p>
@@ -1265,7 +1369,11 @@
         </w:rPr>
       </w:pPr>
     </w:p>
-    <w:p/>
+    <w:p>
+      <w:r>
+        <w:t xml:space="preserve"/>
+      </w:r>
+    </w:p>
     <w:p>
       <w:pPr>
         <w:rPr>
@@ -1273,12 +1381,29 @@
           <w:color w:val="000000" w:themeColor="text1"/>
         </w:rPr>
       </w:pPr>
+      <w:proofErr w:type="gramStart"/>
       <w:r>
         <w:rPr>
           <w:rStyle w:val="IntenseReference"/>
           <w:color w:val="000000" w:themeColor="text1"/>
         </w:rPr>
-        <w:t xml:space="preserve">Industry Dive / Informa TechTarget — Washington, DC | 2018–2025  </w:t>
+        <w:t xml:space="preserve">Industry Dive / Informa TechTarget, </w:t>
+      </w:r>
+      <w:proofErr w:type="gramStart"/>
+      <w:r>
+        <w:rPr>
+          <w:rStyle w:val="IntenseReference"/>
+          <w:color w:val="000000" w:themeColor="text1"/>
+        </w:rPr>
+        <w:t xml:space="preserve">Washington, DC | </w:t>
+      </w:r>
+      <w:proofErr w:type="gramStart"/>
+      <w:r>
+        <w:rPr>
+          <w:rStyle w:val="IntenseReference"/>
+          <w:color w:val="000000" w:themeColor="text1"/>
+        </w:rPr>
+        <w:t xml:space="preserve">2018-2025  </w:t>
       </w:r>
       <w:r>
         <w:rPr>
@@ -1296,12 +1421,13 @@
           <w:b/>
         </w:rPr>
       </w:pPr>
+      <w:proofErr w:type="gramStart"/>
       <w:r>
         <w:rPr>
           <w:rStyle w:val="IntenseReference"/>
           <w:color w:val="000000" w:themeColor="text1"/>
         </w:rPr>
-        <w:t>VP, Engineering</w:t>
+        <w:t xml:space="preserve">VP, Engineering</w:t>
       </w:r>
     </w:p>
     <w:p>
@@ -1320,12 +1446,13 @@
           <w:color w:val="000000" w:themeColor="text1"/>
         </w:rPr>
       </w:pPr>
+      <w:proofErr w:type="gramStart"/>
       <w:r>
         <w:rPr>
           <w:rStyle w:val="IntenseReference"/>
           <w:color w:val="000000" w:themeColor="text1"/>
         </w:rPr>
-        <w:t>Founded and scaled the Brand &amp; Content Engineering platform organization through post-acquisition integration.</w:t>
+        <w:t xml:space="preserve">Founded and scaled the Brand &amp; Content Engineering platform organization through post-acquisition integration.</w:t>
       </w:r>
     </w:p>
     <w:p>
@@ -1347,12 +1474,13 @@
           <w:szCs w:val="21"/>
         </w:rPr>
       </w:pPr>
+      <w:proofErr w:type="gramStart"/>
       <w:r>
         <w:rPr>
           <w:rStyle w:val="IntenseReference"/>
           <w:color w:val="000000" w:themeColor="text1"/>
         </w:rPr>
-        <w:t>Scaled from 1 team (8 engineers) to 5 cross-functional teams (40+ engineers) across multiple time zones, owning shared platform services for 100+ properties used by millions.</w:t>
+        <w:t xml:space="preserve">Scaled from 1 team (8 engineers) to 5 cross-functional teams (40+ engineers) across multiple time zones, owning shared platform services for 100+ properties used by millions.</w:t>
       </w:r>
     </w:p>
     <w:p>
@@ -1374,12 +1502,13 @@
           <w:szCs w:val="21"/>
         </w:rPr>
       </w:pPr>
+      <w:proofErr w:type="gramStart"/>
       <w:r>
         <w:rPr>
           <w:rStyle w:val="IntenseReference"/>
           <w:color w:val="000000" w:themeColor="text1"/>
         </w:rPr>
-        <w:t>Built a repeatable paved-road operating model—automated provisioning and deployment cut average time-to-ship 35%; later adopted across the broader portfolio.</w:t>
+        <w:t xml:space="preserve">Built a repeatable paved-road operating model. Automated provisioning and deployment cut average time-to-ship 35%, then spread across the broader portfolio.</w:t>
       </w:r>
     </w:p>
     <w:p>
@@ -1401,12 +1530,13 @@
           <w:szCs w:val="21"/>
         </w:rPr>
       </w:pPr>
+      <w:proofErr w:type="gramStart"/>
       <w:r>
         <w:rPr>
           <w:rStyle w:val="IntenseReference"/>
           <w:color w:val="000000" w:themeColor="text1"/>
         </w:rPr>
-        <w:t>Shipped an AI-driven lead-qualification system into the core product, automating scoring and reducing manual qualification effort.</w:t>
+        <w:t xml:space="preserve">Shipped an AI-driven lead-qualification system into the core product, automating scoring and reducing manual qualification effort.</w:t>
       </w:r>
     </w:p>
     <w:p>
@@ -1428,12 +1558,13 @@
           <w:szCs w:val="21"/>
         </w:rPr>
       </w:pPr>
+      <w:proofErr w:type="gramStart"/>
       <w:r>
         <w:rPr>
           <w:rStyle w:val="IntenseReference"/>
           <w:color w:val="000000" w:themeColor="text1"/>
         </w:rPr>
-        <w:t>Drove platform observability and reliability: CI/CD maturity, incident management, and automated workflows that improved uptime and developer experience.</w:t>
+        <w:t xml:space="preserve">Drove platform observability and reliability on AWS and Kubernetes: CI/CD maturity, incident management, and automated workflows that improved uptime and developer experience.</w:t>
       </w:r>
     </w:p>
     <w:p>
@@ -1455,12 +1586,13 @@
           <w:szCs w:val="21"/>
         </w:rPr>
       </w:pPr>
+      <w:proofErr w:type="gramStart"/>
       <w:r>
         <w:rPr>
           <w:rStyle w:val="IntenseReference"/>
           <w:color w:val="000000" w:themeColor="text1"/>
         </w:rPr>
-        <w:t>Built the Product Management function from zero and introduced career frameworks and structured feedback, improving retention 15%.</w:t>
+        <w:t xml:space="preserve">Built the Product Management function from zero and introduced career frameworks and structured feedback, improving retention 15%.</w:t>
       </w:r>
     </w:p>
     <w:p>
@@ -1476,7 +1608,11 @@
         </w:rPr>
       </w:pPr>
     </w:p>
-    <w:p/>
+    <w:p>
+      <w:r>
+        <w:t xml:space="preserve"/>
+      </w:r>
+    </w:p>
     <w:p>
       <w:pPr>
         <w:rPr>
@@ -1484,12 +1620,29 @@
           <w:color w:val="000000" w:themeColor="text1"/>
         </w:rPr>
       </w:pPr>
+      <w:proofErr w:type="gramStart"/>
       <w:r>
         <w:rPr>
           <w:rStyle w:val="IntenseReference"/>
           <w:color w:val="000000" w:themeColor="text1"/>
         </w:rPr>
-        <w:t xml:space="preserve">Phone2Action — Arlington, VA | 2016–2017  </w:t>
+        <w:t xml:space="preserve">Phone2Action, </w:t>
+      </w:r>
+      <w:proofErr w:type="gramStart"/>
+      <w:r>
+        <w:rPr>
+          <w:rStyle w:val="IntenseReference"/>
+          <w:color w:val="000000" w:themeColor="text1"/>
+        </w:rPr>
+        <w:t xml:space="preserve">Arlington, VA | </w:t>
+      </w:r>
+      <w:proofErr w:type="gramStart"/>
+      <w:r>
+        <w:rPr>
+          <w:rStyle w:val="IntenseReference"/>
+          <w:color w:val="000000" w:themeColor="text1"/>
+        </w:rPr>
+        <w:t xml:space="preserve">2016-2017  </w:t>
       </w:r>
       <w:r>
         <w:rPr>
@@ -1507,12 +1660,13 @@
           <w:b/>
         </w:rPr>
       </w:pPr>
+      <w:proofErr w:type="gramStart"/>
       <w:r>
         <w:rPr>
           <w:rStyle w:val="IntenseReference"/>
           <w:color w:val="000000" w:themeColor="text1"/>
         </w:rPr>
-        <w:t>VP, Engineering</w:t>
+        <w:t xml:space="preserve">VP, Engineering</w:t>
       </w:r>
     </w:p>
     <w:p>
@@ -1531,12 +1685,13 @@
           <w:color w:val="000000" w:themeColor="text1"/>
         </w:rPr>
       </w:pPr>
+      <w:proofErr w:type="gramStart"/>
       <w:r>
         <w:rPr>
           <w:rStyle w:val="IntenseReference"/>
           <w:color w:val="000000" w:themeColor="text1"/>
         </w:rPr>
-        <w:t>Led engineering through a Series-A growth stage, bringing planning and delivery structure to a fast-scaling team.</w:t>
+        <w:t xml:space="preserve">Led engineering through a Series-A growth stage, bringing planning and delivery structure to a fast-scaling team.</w:t>
       </w:r>
     </w:p>
     <w:p>
@@ -1558,12 +1713,13 @@
           <w:szCs w:val="21"/>
         </w:rPr>
       </w:pPr>
+      <w:proofErr w:type="gramStart"/>
       <w:r>
         <w:rPr>
           <w:rStyle w:val="IntenseReference"/>
           <w:color w:val="000000" w:themeColor="text1"/>
         </w:rPr>
-        <w:t>Stabilized a Series-A engineering org, achieving consistent sprint predictability within 60 days by restructuring planning cadence and clarifying decision rights.</w:t>
+        <w:t xml:space="preserve">Stabilized a Series-A engineering org, achieving consistent sprint predictability within 60 days by restructuring planning cadence and clarifying decision rights.</w:t>
       </w:r>
     </w:p>
     <w:p>
@@ -1585,12 +1741,13 @@
           <w:szCs w:val="21"/>
         </w:rPr>
       </w:pPr>
+      <w:proofErr w:type="gramStart"/>
       <w:r>
         <w:rPr>
           <w:rStyle w:val="IntenseReference"/>
           <w:color w:val="000000" w:themeColor="text1"/>
         </w:rPr>
-        <w:t>Doubled the engineering team while maintaining release quality across web and mobile-responsive experiences.</w:t>
+        <w:t xml:space="preserve">Doubled the engineering team with no loss of release quality by instituting a sprint-planning cadence, code-review gates, and a clear on-call rotation across web and mobile-responsive products.</w:t>
       </w:r>
     </w:p>
     <w:p>
@@ -1606,7 +1763,11 @@
         </w:rPr>
       </w:pPr>
     </w:p>
-    <w:p/>
+    <w:p>
+      <w:r>
+        <w:t xml:space="preserve"/>
+      </w:r>
+    </w:p>
     <w:p>
       <w:pPr>
         <w:shd w:val="clear" w:color="auto" w:fill="323E4F" w:themeFill="text2" w:themeFillShade="BF"/>
@@ -1651,7 +1812,7 @@
           <w:sz w:val="20"/>
           <w:szCs w:val="20"/>
         </w:rPr>
-        <w:t>BS – WEB DEVELOPMENT, INFORMATION TECHNOLOGY</w:t>
+        <w:t>BS, WEB DEVELOPMENT, INFORMATION TECHNOLOGY</w:t>
       </w:r>
       <w:r>
         <w:rPr>
@@ -1684,7 +1845,6 @@
           <w:sz w:val="20"/>
           <w:szCs w:val="20"/>
         </w:rPr>
-        <w:lastRenderedPageBreak/>
         <w:t>Member, Entrepreneurship Institute</w:t>
       </w:r>
     </w:p>
@@ -2026,11 +2186,6 @@
         <w:docPartUnique/>
       </w:docPartObj>
     </w:sdtPr>
-    <w:sdtEndPr>
-      <w:rPr>
-        <w:rStyle w:val="PageNumber"/>
-      </w:rPr>
-    </w:sdtEndPr>
     <w:sdtContent>
       <w:p>
         <w:pPr>
@@ -2089,11 +2244,6 @@
         <w:docPartUnique/>
       </w:docPartObj>
     </w:sdtPr>
-    <w:sdtEndPr>
-      <w:rPr>
-        <w:rStyle w:val="PageNumber"/>
-      </w:rPr>
-    </w:sdtEndPr>
     <w:sdtContent>
       <w:p>
         <w:pPr>

</xml_diff>